<commit_message>
HSF FORGE: record the launch controls round and the Director's decisions
- HSF-PORTAL-ARCHITECTURE 1.2: gate, verification, scanning, two year
  limit, deletion journey with PIN, live settings still needed
- SPEC register: HSF-1 sign off instruction, HSF-10 closed, HSF-19 and
  HSF-20 decided, HSF-22 approved, B14.8 for this round
- BUILD-STATE and SOP updated; onboarding form regenerated with the
  current noise and asbestos wording

Co-Authored-By: Claude Opus 5.5 <noreply@anthropic.com>
Claude-Session: https://claude.ai/code/session_015jLkVnrqS5Xy7b2wPjeWNK
</commit_message>
<xml_diff>
--- a/msp-forge/form/onboarding_form.docx
+++ b/msp-forge/form/onboarding_form.docx
@@ -2287,7 +2287,7 @@
                 <w:sz w:val="18"/>
                 <w:szCs w:val="18"/>
               </w:rPr>
-              <w:t xml:space="preserve">Noise-Induced Hearing Loss Regulations / Noise Exposure Regulations</w:t>
+              <w:t xml:space="preserve">Noise Exposure Regulations, 2024 (these replaced the Noise Induced Hearing Loss Regulations, 2003 from 6 September 2026)</w:t>
             </w:r>
           </w:p>
         </w:tc>
@@ -2333,7 +2333,7 @@
                 <w:sz w:val="18"/>
                 <w:szCs w:val="18"/>
               </w:rPr>
-              <w:t xml:space="preserve">Asbestos Abatement Regulations</w:t>
+              <w:t xml:space="preserve">Work with asbestos</w:t>
             </w:r>
           </w:p>
         </w:tc>
@@ -14525,7 +14525,7 @@
           <w:sz w:val="20"/>
           <w:szCs w:val="20"/>
         </w:rPr>
-        <w:t xml:space="preserve">Select from the governed list. Currently selectable: CONSTR-CIVILS (Construction, civil engineering works). Further industries become selectable as they pass kernel verification. If your industry is not listed, enter OTHER and describe your business; an OTHER selection routes to human review and never auto generates.</w:t>
+        <w:t xml:space="preserve">Select from the governed list. Currently selectable: CONSTR-CIVILS, CONSTR-BUILD, CONSTR-DEMO (demolition), CONSTR-ELEC (electrical construction), CONSTR-ROADS (roadworks), MANU-FOOD, MANU-METAL, MANU-CHEM (chemical), MANU-AUTO (automotive), MANU-TEX (textiles), MANU-PLASTIC (plastics), MANU-WOOD (wood and furniture), MIN-GOLD, MIN-QUARRY, MIN-COAL, MIN-PLAT (platinum), MIN-CHROME, MIN-DIAMOND, TRANS-ROAD, TRANS-WARE, TRANS-RAIL, TRANS-PORT (ports and terminals), TRANS-AVGH (aviation ground handling), AGRI-CROP, AGRI-LIVE (livestock), AGRI-FOREST (forestry), HLTH-CLINIC (clinics and practices), HLTH-LAB (laboratories), HLTH-HOSP (hospitals), UTIL-GEN (power generation), UTIL-WATER (water and wastewater), UTIL-RENEW (renewable energy), SEC-GUARD, SEC-ARMED (armed response and cash in transit), CLEAN-COMM, CLEAN-SPEC (specialised hygiene), RET-STORE, RET-WHOLE (wholesale and distribution), HOSP-ACCOM (hotels), HOSP-FOOD (restaurants and catering), WASTE-COLL (collection), WASTE-SITE (landfill and transfer), WASTE-REC (recycling), TEL-TOWER (tower work), TEL-FIELD (field network services), TEL-DC (data centres), PETRO-BULK (refining and terminals), PETRO-RETAIL (service stations), PETRO-GAS (LPG and industrial gases), GOV-ADMIN (municipal administration), GOV-WORKS (public works), GOV-EMERG (emergency and traffic services), EDU-SCHOOL (schools and early childhood), EDU-TERTIARY (tertiary and training), OFF-CORP (corporate offices), OFF-CALL (contact centres). If your industry is not listed, enter OTHER and describe your business; an OTHER selection routes to human review and never auto generates.</w:t>
       </w:r>
     </w:p>
     <w:tbl>
@@ -14563,7 +14563,7 @@
                 <w:sz w:val="18"/>
                 <w:szCs w:val="18"/>
               </w:rPr>
-              <w:t xml:space="preserve">Industry code (for example CONSTR, or OTHER) (required)</w:t>
+              <w:t xml:space="preserve">Industry code (CONSTR, MANU, MINING, TRANS, AGRI, HEALTH, UTIL, SEC, CLEAN, RETAIL, HOSP, WASTE, TEL, PETRO, GOV, EDU, OFFICE, or OTHER) (required)</w:t>
             </w:r>
           </w:p>
         </w:tc>
@@ -14609,7 +14609,7 @@
                 <w:sz w:val="18"/>
                 <w:szCs w:val="18"/>
               </w:rPr>
-              <w:t xml:space="preserve">Subindustry code (for example CONSTR-CIVILS, or OTHER) (required)</w:t>
+              <w:t xml:space="preserve">Subindustry code (see the selectable list above, or OTHER) (required)</w:t>
             </w:r>
           </w:p>
         </w:tc>

</xml_diff>